<commit_message>
feat: initialize project documentation and core infrastructure including PWA support and database migrations
</commit_message>
<xml_diff>
--- a/word/02-Roadmap.docx
+++ b/word/02-Roadmap.docx
@@ -1223,6 +1223,43 @@
       </w:pPr>
       <w:r>
         <w:t xml:space="preserve">Auditoria de acessibilidade (contraste AAA, foco visível, leitor de tela).</w:t>
+      </w:r>
+    </w:p>
+    <w:p>
+      <w:pPr>
+        <w:numPr>
+          <w:ilvl w:val="0"/>
+          <w:numId w:val="1007"/>
+        </w:numPr>
+        <w:pStyle w:val="Compact"/>
+      </w:pPr>
+      <w:r>
+        <w:rPr>
+          <w:bCs/>
+          <w:b/>
+        </w:rPr>
+        <w:t xml:space="preserve">Diversificação de mecânicas pedagógicas</w:t>
+      </w:r>
+      <w:r>
+        <w:t xml:space="preserve"> </w:t>
+      </w:r>
+      <w:r>
+        <w:t xml:space="preserve">(sugerido por educadores em 09/05/2026, grupo de WhatsApp da faculdade): intercalar quizzes com formatos complementares — drag-and-drop cronológico (linha do tempo), mapa interativo (geografia + rotas comerciais), áudio-quiz (reconhecer instrumento/idioma), micro-escrita (resposta curta com correção por palavra-chave) e associação imagem-conceito. Objetivo: reduzir fadiga de formato único e atender estilos cognitivos distintos. Implementação faseada — formato por formato, mantendo o quiz como esqueleto. Detalhamento em</w:t>
+      </w:r>
+      <w:r>
+        <w:t xml:space="preserve"> </w:t>
+      </w:r>
+      <w:r>
+        <w:rPr>
+          <w:rStyle w:val="VerbatimChar"/>
+        </w:rPr>
+        <w:t xml:space="preserve">docs/PEDAGOGIA-MECANICAS.md</w:t>
+      </w:r>
+      <w:r>
+        <w:t xml:space="preserve"> </w:t>
+      </w:r>
+      <w:r>
+        <w:t xml:space="preserve">(a redigir).</w:t>
       </w:r>
     </w:p>
     <w:bookmarkEnd w:id="26"/>

</xml_diff>